<commit_message>
Update report captions and disclosure
</commit_message>
<xml_diff>
--- a/reflection.docx
+++ b/reflection.docx
@@ -58,6 +58,20 @@
       </w:r>
     </w:p>
     <w:p>
+      <w:pPr>
+        <w:keepNext w:val="0"/>
+        <w:jc w:val="center"/>
+      </w:pPr>
+      <w:r>
+        <w:rPr>
+          <w:i/>
+          <w:color w:val="505050"/>
+          <w:sz w:val="20"/>
+        </w:rPr>
+        <w:t>Figure 1. Coverage report generated by coverage.py, showing statement and branch coverage for each source file.</w:t>
+      </w:r>
+    </w:p>
+    <w:p>
       <w:r>
         <w:rPr>
           <w:noProof/>
@@ -113,6 +127,20 @@
       </w:r>
     </w:p>
     <w:p>
+      <w:pPr>
+        <w:keepNext w:val="0"/>
+        <w:jc w:val="center"/>
+      </w:pPr>
+      <w:r>
+        <w:rPr>
+          <w:i/>
+          <w:color w:val="505050"/>
+          <w:sz w:val="20"/>
+        </w:rPr>
+        <w:t>Figure 2. Testing organization diagram showing how fixtures, collaborators, services, and test files connect.</w:t>
+      </w:r>
+    </w:p>
+    <w:p>
       <w:r>
         <w:t>1. What you built</w:t>
       </w:r>
@@ -132,7 +160,7 @@
     <w:p/>
     <w:p>
       <w:r>
-        <w:t>The hardest tests to design were the interaction-style reminder tests in test_reminders.py. Most other tests check one clear final result, such as whether a task was created or whether an invalid title raises an error. The reminder tests were different because they needed to check whether the task service correctly worked with another collaborator. For example, the test using a mock reminder checks that the reminder service was actually called with the right task and time, generlly London style test are more difficlut to write as you have to think of how to interact with other modules.</w:t>
+        <w:t>The hardest tests to design were the interaction-style reminder tests in test_reminders.py. Most other tests check one clear final result, such as whether a task was created or whether an invalid title raises an error. The reminder tests were different because they needed to check whether the task service correctly worked with another collaborator. For example, the test using a mock reminder checks that the reminder service was actually called with the right task and time. In general, London-style tests are more difficult to write because they require thinking about how modules interact.</w:t>
       </w:r>
     </w:p>
     <w:p/>
@@ -172,7 +200,7 @@
     <w:p/>
     <w:p>
       <w:r>
-        <w:t>The test I think most useful is test_list_tasks_does_not_return_other_users_tasks. I think it has strong regression protection because user isolation is one of the most important rules in the project, many websites nowsdays also encounter this kind of problem. If Bob can see Alice’s tasks, that is a serious privacy problem. It is also refactoring resistant because it does not care how tasks are stored internally; it only checks the visible behavior. It gives fast feedback because everything runs in memory, and it is maintainable because the setup is easy to understand.</w:t>
+        <w:t>The test I think most useful is test_list_tasks_does_not_return_other_users_tasks. I think it has strong regression protection because user isolation is one of the most important rules in the project, many websites nowadays also encounter this kind of problem. If Bob can see Alice’s tasks, that is a serious privacy problem. It is also refactoring resistant because it does not care how tasks are stored internally; it only checks the visible behavior. It gives fast feedback because everything runs in memory, and it is maintainable because the setup is easy to understand.</w:t>
       </w:r>
     </w:p>
     <w:p/>
@@ -191,6 +219,33 @@
     <w:p>
       <w:r>
         <w:t>If I started over, I would make the task update behavior easier to test, maybe by splitting it into clearer smaller paths instead of handling many optional fields in one place. What surprised me most was how much the design of the backend affected the tests. Because the services used dependency injection, I could replace storage, time, and reminders in the tests. If the backend had created all of those dependencies internally, the tests would have been much harder to write.</w:t>
+      </w:r>
+    </w:p>
+    <w:p>
+      <w:pPr>
+        <w:spacing w:before="80" w:after="240"/>
+      </w:pPr>
+    </w:p>
+    <w:p>
+      <w:pPr>
+        <w:spacing w:before="80" w:after="240"/>
+      </w:pPr>
+    </w:p>
+    <w:p/>
+    <w:p>
+      <w:pPr>
+        <w:spacing w:before="360" w:after="200"/>
+      </w:pPr>
+      <w:r>
+        <w:t>AI usage disclosure</w:t>
+      </w:r>
+    </w:p>
+    <w:p>
+      <w:pPr>
+        <w:spacing w:after="0"/>
+      </w:pPr>
+      <w:r>
+        <w:t>Generative AI was used to help create the initial backend code under src/. I also used AI to understand the structure of the src code after it was generated, because I had not designed a backend project like this before and the service/repository layout felt overwhelming at first. I asked AI to explain how the models, repositories, and services fit together, and to point out which behaviors would be useful to test. After reading a few example ideas, I used that guidance to write and revise the tests myself. AI was also used to help organize the wording of this report and to prepare supporting report assets such as the coverage and testing-organization images.</w:t>
       </w:r>
     </w:p>
     <w:sectPr>

</xml_diff>

<commit_message>
Add report cover page
</commit_message>
<xml_diff>
--- a/reflection.docx
+++ b/reflection.docx
@@ -2,6 +2,157 @@
 <file path=word/document.xml><?xml version="1.0" encoding="utf-8"?>
 <w:document xmlns:wpc="http://schemas.microsoft.com/office/word/2010/wordprocessingCanvas" xmlns:cx="http://schemas.microsoft.com/office/drawing/2014/chartex" xmlns:cx1="http://schemas.microsoft.com/office/drawing/2015/9/8/chartex" xmlns:cx2="http://schemas.microsoft.com/office/drawing/2015/10/21/chartex" xmlns:cx3="http://schemas.microsoft.com/office/drawing/2016/5/9/chartex" xmlns:cx4="http://schemas.microsoft.com/office/drawing/2016/5/10/chartex" xmlns:cx5="http://schemas.microsoft.com/office/drawing/2016/5/11/chartex" xmlns:cx6="http://schemas.microsoft.com/office/drawing/2016/5/12/chartex" xmlns:cx7="http://schemas.microsoft.com/office/drawing/2016/5/13/chartex" xmlns:cx8="http://schemas.microsoft.com/office/drawing/2016/5/14/chartex" xmlns:mc="http://schemas.openxmlformats.org/markup-compatibility/2006" xmlns:aink="http://schemas.microsoft.com/office/drawing/2016/ink" xmlns:am3d="http://schemas.microsoft.com/office/drawing/2017/model3d" xmlns:o="urn:schemas-microsoft-com:office:office" xmlns:oel="http://schemas.microsoft.com/office/2019/extlst" xmlns:r="http://schemas.openxmlformats.org/officeDocument/2006/relationships" xmlns:m="http://schemas.openxmlformats.org/officeDocument/2006/math" xmlns:v="urn:schemas-microsoft-com:vml" xmlns:wp14="http://schemas.microsoft.com/office/word/2010/wordprocessingDrawing" xmlns:wp="http://schemas.openxmlformats.org/drawingml/2006/wordprocessingDrawing" xmlns:w10="urn:schemas-microsoft-com:office:word" xmlns:w="http://schemas.openxmlformats.org/wordprocessingml/2006/main" xmlns:w14="http://schemas.microsoft.com/office/word/2010/wordml" xmlns:w15="http://schemas.microsoft.com/office/word/2012/wordml" xmlns:w16cex="http://schemas.microsoft.com/office/word/2018/wordml/cex" xmlns:w16cid="http://schemas.microsoft.com/office/word/2016/wordml/cid" xmlns:w16="http://schemas.microsoft.com/office/word/2018/wordml" xmlns:w16du="http://schemas.microsoft.com/office/word/2023/wordml/word16du" xmlns:w16sdtdh="http://schemas.microsoft.com/office/word/2020/wordml/sdtdatahash" xmlns:w16sdtfl="http://schemas.microsoft.com/office/word/2024/wordml/sdtformatlock" xmlns:w16se="http://schemas.microsoft.com/office/word/2015/wordml/symex" xmlns:wpg="http://schemas.microsoft.com/office/word/2010/wordprocessingGroup" xmlns:wpi="http://schemas.microsoft.com/office/word/2010/wordprocessingInk" xmlns:wne="http://schemas.microsoft.com/office/word/2006/wordml" xmlns:wps="http://schemas.microsoft.com/office/word/2010/wordprocessingShape" mc:Ignorable="w14 w15 w16se w16cid w16 w16cex w16sdtdh w16sdtfl w16du wp14">
   <w:body>
+    <w:p>
+      <w:pPr>
+        <w:jc w:val="center"/>
+      </w:pPr>
+      <w:r>
+        <w:rPr>
+          <w:b w:val="0"/>
+          <w:color w:val="1F2933"/>
+          <w:sz w:val="24"/>
+        </w:rPr>
+      </w:r>
+    </w:p>
+    <w:p>
+      <w:pPr>
+        <w:jc w:val="center"/>
+      </w:pPr>
+      <w:r>
+        <w:rPr>
+          <w:b/>
+          <w:color w:val="1F2933"/>
+          <w:sz w:val="56"/>
+        </w:rPr>
+        <w:t>Assignment 3 Report</w:t>
+      </w:r>
+    </w:p>
+    <w:p>
+      <w:pPr>
+        <w:jc w:val="center"/>
+      </w:pPr>
+      <w:r>
+        <w:rPr>
+          <w:b w:val="0"/>
+          <w:color w:val="52606D"/>
+          <w:sz w:val="32"/>
+        </w:rPr>
+        <w:t>Week 4 To-Do List Backend Testing Report</w:t>
+      </w:r>
+    </w:p>
+    <w:p>
+      <w:pPr>
+        <w:jc w:val="center"/>
+      </w:pPr>
+      <w:r>
+        <w:rPr>
+          <w:b w:val="0"/>
+          <w:color w:val="1F2933"/>
+          <w:sz w:val="26"/>
+        </w:rPr>
+      </w:r>
+      <w:r>
+        <w:rPr>
+          <w:b/>
+          <w:color w:val="1F2933"/>
+          <w:sz w:val="26"/>
+        </w:rPr>
+        <w:t xml:space="preserve">Name: </w:t>
+      </w:r>
+      <w:r>
+        <w:rPr>
+          <w:color w:val="1F2933"/>
+          <w:sz w:val="26"/>
+        </w:rPr>
+        <w:t>Yiyang Shen</w:t>
+      </w:r>
+    </w:p>
+    <w:p>
+      <w:pPr>
+        <w:jc w:val="center"/>
+      </w:pPr>
+      <w:r>
+        <w:rPr>
+          <w:b w:val="0"/>
+          <w:color w:val="1F2933"/>
+          <w:sz w:val="26"/>
+        </w:rPr>
+      </w:r>
+      <w:r>
+        <w:rPr>
+          <w:b/>
+          <w:color w:val="1F2933"/>
+          <w:sz w:val="26"/>
+        </w:rPr>
+        <w:t xml:space="preserve">CNet ID: </w:t>
+      </w:r>
+      <w:r>
+        <w:rPr>
+          <w:color w:val="1F2933"/>
+          <w:sz w:val="26"/>
+        </w:rPr>
+        <w:t>yiyangshen</w:t>
+      </w:r>
+    </w:p>
+    <w:p>
+      <w:pPr>
+        <w:jc w:val="center"/>
+      </w:pPr>
+      <w:r>
+        <w:rPr>
+          <w:b w:val="0"/>
+          <w:color w:val="1F2933"/>
+          <w:sz w:val="26"/>
+        </w:rPr>
+      </w:r>
+      <w:r>
+        <w:rPr>
+          <w:b/>
+          <w:color w:val="1F2933"/>
+          <w:sz w:val="26"/>
+        </w:rPr>
+        <w:t xml:space="preserve">Date: </w:t>
+      </w:r>
+      <w:r>
+        <w:rPr>
+          <w:color w:val="1F2933"/>
+          <w:sz w:val="26"/>
+        </w:rPr>
+        <w:t>April 24, 2026</w:t>
+      </w:r>
+    </w:p>
+    <w:p>
+      <w:pPr>
+        <w:jc w:val="center"/>
+      </w:pPr>
+      <w:r>
+        <w:rPr>
+          <w:b w:val="0"/>
+          <w:color w:val="1F2933"/>
+          <w:sz w:val="26"/>
+        </w:rPr>
+      </w:r>
+      <w:r>
+        <w:rPr>
+          <w:b/>
+          <w:color w:val="1F2933"/>
+          <w:sz w:val="26"/>
+        </w:rPr>
+        <w:t xml:space="preserve">GitHub Repository: </w:t>
+      </w:r>
+      <w:r>
+        <w:rPr>
+          <w:color w:val="1F2933"/>
+          <w:sz w:val="26"/>
+        </w:rPr>
+        <w:t>https://github.com/yiyangshen04/sqa-week4</w:t>
+      </w:r>
+    </w:p>
+    <w:p>
+      <w:r>
+        <w:br w:type="page"/>
+      </w:r>
+    </w:p>
     <w:p>
       <w:r>
         <w:rPr>
@@ -248,6 +399,42 @@
         <w:t>Generative AI was used to help create the initial backend code under src/. I also used AI to understand the structure of the src code after it was generated, because I had not designed a backend project like this before and the service/repository layout felt overwhelming at first. I asked AI to explain how the models, repositories, and services fit together, and to point out which behaviors would be useful to test. After reading a few example ideas, I used that guidance to write and revise the tests myself. AI was also used to help organize the wording of this report and to prepare supporting report assets such as the coverage and testing-organization images.</w:t>
       </w:r>
     </w:p>
+    <w:p>
+      <w:pPr>
+        <w:spacing w:after="2200"/>
+      </w:pPr>
+    </w:p>
+    <w:p>
+      <w:pPr>
+        <w:spacing w:after="360"/>
+      </w:pPr>
+    </w:p>
+    <w:p>
+      <w:pPr>
+        <w:spacing w:after="1400"/>
+      </w:pPr>
+    </w:p>
+    <w:p>
+      <w:pPr>
+        <w:spacing w:after="200"/>
+      </w:pPr>
+    </w:p>
+    <w:p>
+      <w:pPr>
+        <w:spacing w:after="200"/>
+      </w:pPr>
+    </w:p>
+    <w:p>
+      <w:pPr>
+        <w:spacing w:after="200"/>
+      </w:pPr>
+    </w:p>
+    <w:p>
+      <w:pPr>
+        <w:spacing w:after="200"/>
+      </w:pPr>
+    </w:p>
+    <w:p/>
     <w:sectPr>
       <w:pgSz w:w="12240" w:h="15840"/>
       <w:pgMar w:top="1440" w:right="1440" w:bottom="1440" w:left="1440" w:header="708" w:footer="708" w:gutter="0"/>

</xml_diff>